<commit_message>
Test jusqu'a l'envoye des emails
</commit_message>
<xml_diff>
--- a/NIJAC_Manuel_Nominateur.docx
+++ b/NIJAC_Manuel_Nominateur.docx
@@ -23,12 +23,6 @@
         <w:gridCol w:w="9026"/>
       </w:tblGrid>
       <w:tr>
-        <w:tblPrEx>
-          <w:tblCellMar>
-            <w:top w:w="0" w:type="dxa"/>
-            <w:bottom w:w="0" w:type="dxa"/>
-          </w:tblCellMar>
-        </w:tblPrEx>
         <w:tc>
           <w:tcPr>
             <w:tcW w:w="0" w:type="auto"/>
@@ -121,6 +115,75 @@
     </w:p>
     <w:p>
       <w:pPr>
+        <w:spacing w:after="40"/>
+      </w:pPr>
+    </w:p>
+    <w:p>
+      <w:pPr>
+        <w:spacing w:after="40"/>
+      </w:pPr>
+      <w:r>
+        <w:t>Le lien pour accéder à l’application sur le site de production est :</w:t>
+      </w:r>
+    </w:p>
+    <w:p>
+      <w:pPr>
+        <w:spacing w:after="40"/>
+      </w:pPr>
+    </w:p>
+    <w:p>
+      <w:pPr>
+        <w:spacing w:after="40"/>
+        <w:rPr>
+          <w:b/>
+          <w:bCs/>
+          <w:sz w:val="28"/>
+          <w:szCs w:val="28"/>
+        </w:rPr>
+      </w:pPr>
+      <w:hyperlink r:id="rId7" w:history="1">
+        <w:r>
+          <w:rPr>
+            <w:rStyle w:val="Lienhypertexte"/>
+            <w:b/>
+            <w:bCs/>
+            <w:sz w:val="28"/>
+            <w:szCs w:val="28"/>
+          </w:rPr>
+          <w:t>https://www.ligue-normandie-tt.fr/nijac/</w:t>
+        </w:r>
+      </w:hyperlink>
+    </w:p>
+    <w:p>
+      <w:pPr>
+        <w:spacing w:after="40"/>
+        <w:rPr>
+          <w:b/>
+          <w:bCs/>
+          <w:sz w:val="28"/>
+          <w:szCs w:val="28"/>
+        </w:rPr>
+      </w:pPr>
+    </w:p>
+    <w:p>
+      <w:pPr>
+        <w:spacing w:after="40"/>
+      </w:pPr>
+      <w:r>
+        <w:t>L’application est en mode développement</w:t>
+      </w:r>
+      <w:r>
+        <w:t xml:space="preserve"> tous les emails sont envoyé a une seule personne défini dans les paramètres de configuration</w:t>
+      </w:r>
+      <w:r>
+        <w:t xml:space="preserve"> menu administration disponible seulement aux administrateurs</w:t>
+      </w:r>
+      <w:r>
+        <w:t>.</w:t>
+      </w:r>
+    </w:p>
+    <w:p>
+      <w:pPr>
         <w:spacing w:before="160"/>
       </w:pPr>
     </w:p>
@@ -169,20 +232,32 @@
         <w:spacing w:before="40" w:after="40"/>
       </w:pPr>
       <w:r>
-        <w:t>Saisissez votre identifiant (login) dans le champ prévu.</w:t>
-      </w:r>
-    </w:p>
-    <w:p>
-      <w:pPr>
-        <w:pStyle w:val="Paragraphedeliste"/>
-        <w:numPr>
-          <w:ilvl w:val="0"/>
-          <w:numId w:val="2"/>
-        </w:numPr>
-        <w:spacing w:before="40" w:after="40"/>
-      </w:pPr>
-      <w:r>
-        <w:t>Saisissez votre mot de passe. Cliquez sur l’icône œil pour l’afficher ou le masquer.</w:t>
+        <w:t>Saisissez votre identifiant (login) dans le champ prévu</w:t>
+      </w:r>
+      <w:r>
+        <w:t>, Généralement votre Nom en majuscule</w:t>
+      </w:r>
+      <w:r>
+        <w:t>.</w:t>
+      </w:r>
+    </w:p>
+    <w:p>
+      <w:pPr>
+        <w:pStyle w:val="Paragraphedeliste"/>
+        <w:numPr>
+          <w:ilvl w:val="0"/>
+          <w:numId w:val="2"/>
+        </w:numPr>
+        <w:spacing w:before="40" w:after="40"/>
+      </w:pPr>
+      <w:r>
+        <w:t>Saisissez votre mot de passe</w:t>
+      </w:r>
+      <w:r>
+        <w:t>, lors le la création du compte un mot de passe générique est mis à tous les utilisateur ‘Change_On_Install’’</w:t>
+      </w:r>
+      <w:r>
+        <w:t>. Cliquez sur l’icône œil pour l’afficher ou le masquer.</w:t>
       </w:r>
     </w:p>
     <w:p>
@@ -237,12 +312,6 @@
         <w:gridCol w:w="9026"/>
       </w:tblGrid>
       <w:tr>
-        <w:tblPrEx>
-          <w:tblCellMar>
-            <w:top w:w="0" w:type="dxa"/>
-            <w:bottom w:w="0" w:type="dxa"/>
-          </w:tblCellMar>
-        </w:tblPrEx>
         <w:tc>
           <w:tcPr>
             <w:tcW w:w="0" w:type="auto"/>
@@ -308,12 +377,6 @@
         <w:gridCol w:w="9026"/>
       </w:tblGrid>
       <w:tr>
-        <w:tblPrEx>
-          <w:tblCellMar>
-            <w:top w:w="0" w:type="dxa"/>
-            <w:bottom w:w="0" w:type="dxa"/>
-          </w:tblCellMar>
-        </w:tblPrEx>
         <w:tc>
           <w:tcPr>
             <w:tcW w:w="0" w:type="auto"/>
@@ -333,6 +396,9 @@
           </w:tcPr>
           <w:p>
             <w:r>
+              <w:rPr>
+                <w:noProof/>
+              </w:rPr>
               <w:drawing>
                 <wp:inline distT="0" distB="0" distL="0" distR="0" wp14:anchorId="0CADEFC8" wp14:editId="07D48D4C">
                   <wp:extent cx="5468113" cy="3591426"/>
@@ -349,7 +415,7 @@
                           <pic:cNvPicPr/>
                         </pic:nvPicPr>
                         <pic:blipFill>
-                          <a:blip r:embed="rId7"/>
+                          <a:blip r:embed="rId8"/>
                           <a:stretch>
                             <a:fillRect/>
                           </a:stretch>
@@ -409,12 +475,6 @@
         <w:gridCol w:w="6126"/>
       </w:tblGrid>
       <w:tr>
-        <w:tblPrEx>
-          <w:tblCellMar>
-            <w:top w:w="0" w:type="dxa"/>
-            <w:bottom w:w="0" w:type="dxa"/>
-          </w:tblCellMar>
-        </w:tblPrEx>
         <w:tc>
           <w:tcPr>
             <w:tcW w:w="2900" w:type="dxa"/>
@@ -474,12 +534,6 @@
         </w:tc>
       </w:tr>
       <w:tr>
-        <w:tblPrEx>
-          <w:tblCellMar>
-            <w:top w:w="0" w:type="dxa"/>
-            <w:bottom w:w="0" w:type="dxa"/>
-          </w:tblCellMar>
-        </w:tblPrEx>
         <w:tc>
           <w:tcPr>
             <w:tcW w:w="2900" w:type="dxa"/>
@@ -649,12 +703,6 @@
         <w:gridCol w:w="9628"/>
       </w:tblGrid>
       <w:tr>
-        <w:tblPrEx>
-          <w:tblCellMar>
-            <w:top w:w="0" w:type="dxa"/>
-            <w:bottom w:w="0" w:type="dxa"/>
-          </w:tblCellMar>
-        </w:tblPrEx>
         <w:tc>
           <w:tcPr>
             <w:tcW w:w="0" w:type="auto"/>
@@ -680,6 +728,7 @@
               <w:rPr>
                 <w:i/>
                 <w:iCs/>
+                <w:noProof/>
                 <w:color w:val="AAAAAA"/>
                 <w:sz w:val="19"/>
                 <w:szCs w:val="19"/>
@@ -700,7 +749,7 @@
                           <pic:cNvPicPr/>
                         </pic:nvPicPr>
                         <pic:blipFill>
-                          <a:blip r:embed="rId8"/>
+                          <a:blip r:embed="rId9"/>
                           <a:stretch>
                             <a:fillRect/>
                           </a:stretch>
@@ -776,12 +825,6 @@
         <w:gridCol w:w="6031"/>
       </w:tblGrid>
       <w:tr>
-        <w:tblPrEx>
-          <w:tblCellMar>
-            <w:top w:w="0" w:type="dxa"/>
-            <w:bottom w:w="0" w:type="dxa"/>
-          </w:tblCellMar>
-        </w:tblPrEx>
         <w:trPr>
           <w:trHeight w:val="453"/>
         </w:trPr>
@@ -838,25 +881,12 @@
                 <w:sz w:val="19"/>
                 <w:szCs w:val="19"/>
               </w:rPr>
-              <w:t>E00</w:t>
-            </w:r>
-            <w:r>
-              <w:rPr>
-                <w:sz w:val="19"/>
-                <w:szCs w:val="19"/>
-              </w:rPr>
-              <w:t>7</w:t>
+              <w:t>E007</w:t>
             </w:r>
           </w:p>
         </w:tc>
       </w:tr>
       <w:tr>
-        <w:tblPrEx>
-          <w:tblCellMar>
-            <w:top w:w="0" w:type="dxa"/>
-            <w:bottom w:w="0" w:type="dxa"/>
-          </w:tblCellMar>
-        </w:tblPrEx>
         <w:trPr>
           <w:trHeight w:val="453"/>
         </w:trPr>
@@ -928,75 +958,14 @@
     <w:p/>
     <w:p>
       <w:r>
+        <w:rPr>
+          <w:noProof/>
+        </w:rPr>
         <w:drawing>
           <wp:inline distT="0" distB="0" distL="0" distR="0" wp14:anchorId="168F83FC" wp14:editId="42D20134">
             <wp:extent cx="6120130" cy="2880995"/>
             <wp:effectExtent l="0" t="0" r="0" b="0"/>
             <wp:docPr id="3" name="Image 3"/>
-            <wp:cNvGraphicFramePr>
-              <a:graphicFrameLocks xmlns:a="http://schemas.openxmlformats.org/drawingml/2006/main" noChangeAspect="1"/>
-            </wp:cNvGraphicFramePr>
-            <a:graphic xmlns:a="http://schemas.openxmlformats.org/drawingml/2006/main">
-              <a:graphicData uri="http://schemas.openxmlformats.org/drawingml/2006/picture">
-                <pic:pic xmlns:pic="http://schemas.openxmlformats.org/drawingml/2006/picture">
-                  <pic:nvPicPr>
-                    <pic:cNvPr id="1" name=""/>
-                    <pic:cNvPicPr/>
-                  </pic:nvPicPr>
-                  <pic:blipFill>
-                    <a:blip r:embed="rId9"/>
-                    <a:stretch>
-                      <a:fillRect/>
-                    </a:stretch>
-                  </pic:blipFill>
-                  <pic:spPr>
-                    <a:xfrm>
-                      <a:off x="0" y="0"/>
-                      <a:ext cx="6120130" cy="2880995"/>
-                    </a:xfrm>
-                    <a:prstGeom prst="rect">
-                      <a:avLst/>
-                    </a:prstGeom>
-                  </pic:spPr>
-                </pic:pic>
-              </a:graphicData>
-            </a:graphic>
-          </wp:inline>
-        </w:drawing>
-      </w:r>
-    </w:p>
-    <w:p/>
-    <w:p>
-      <w:pPr>
-        <w:pStyle w:val="Titre2"/>
-        <w:pageBreakBefore/>
-        <w:pBdr>
-          <w:bottom w:val="single" w:sz="6" w:space="2" w:color="2557A7"/>
-        </w:pBdr>
-        <w:spacing w:before="0"/>
-      </w:pPr>
-      <w:r>
-        <w:lastRenderedPageBreak/>
-        <w:t xml:space="preserve">4. </w:t>
-      </w:r>
-      <w:r>
-        <w:t>Saisie des disponibilités</w:t>
-      </w:r>
-      <w:r>
-        <w:t xml:space="preserve"> </w:t>
-      </w:r>
-      <w:r>
-        <w:t>(E012)</w:t>
-      </w:r>
-    </w:p>
-    <w:p/>
-    <w:p>
-      <w:r>
-        <w:drawing>
-          <wp:inline distT="0" distB="0" distL="0" distR="0" wp14:anchorId="31266137" wp14:editId="4DCAB94E">
-            <wp:extent cx="6120130" cy="4387850"/>
-            <wp:effectExtent l="0" t="0" r="0" b="0"/>
-            <wp:docPr id="4" name="Image 4"/>
             <wp:cNvGraphicFramePr>
               <a:graphicFrameLocks xmlns:a="http://schemas.openxmlformats.org/drawingml/2006/main" noChangeAspect="1"/>
             </wp:cNvGraphicFramePr>
@@ -1016,7 +985,7 @@
                   <pic:spPr>
                     <a:xfrm>
                       <a:off x="0" y="0"/>
-                      <a:ext cx="6120130" cy="4387850"/>
+                      <a:ext cx="6120130" cy="2880995"/>
                     </a:xfrm>
                     <a:prstGeom prst="rect">
                       <a:avLst/>
@@ -1031,12 +1000,36 @@
     </w:p>
     <w:p/>
     <w:p>
-      <w:r>
+      <w:pPr>
+        <w:pStyle w:val="Titre2"/>
+        <w:pageBreakBefore/>
+        <w:pBdr>
+          <w:bottom w:val="single" w:sz="6" w:space="2" w:color="2557A7"/>
+        </w:pBdr>
+        <w:spacing w:before="0"/>
+      </w:pPr>
+      <w:r>
+        <w:lastRenderedPageBreak/>
+        <w:t xml:space="preserve">4. </w:t>
+      </w:r>
+      <w:r>
+        <w:t xml:space="preserve">Saisie des disponibilités </w:t>
+      </w:r>
+      <w:r>
+        <w:t>(E012)</w:t>
+      </w:r>
+    </w:p>
+    <w:p/>
+    <w:p>
+      <w:r>
+        <w:rPr>
+          <w:noProof/>
+        </w:rPr>
         <w:drawing>
-          <wp:inline distT="0" distB="0" distL="0" distR="0" wp14:anchorId="7CDE46D5" wp14:editId="23FF07C6">
-            <wp:extent cx="6120130" cy="1374775"/>
+          <wp:inline distT="0" distB="0" distL="0" distR="0" wp14:anchorId="31266137" wp14:editId="4DCAB94E">
+            <wp:extent cx="6120130" cy="4387850"/>
             <wp:effectExtent l="0" t="0" r="0" b="0"/>
-            <wp:docPr id="5" name="Image 5"/>
+            <wp:docPr id="4" name="Image 4"/>
             <wp:cNvGraphicFramePr>
               <a:graphicFrameLocks xmlns:a="http://schemas.openxmlformats.org/drawingml/2006/main" noChangeAspect="1"/>
             </wp:cNvGraphicFramePr>
@@ -1056,7 +1049,7 @@
                   <pic:spPr>
                     <a:xfrm>
                       <a:off x="0" y="0"/>
-                      <a:ext cx="6120130" cy="1374775"/>
+                      <a:ext cx="6120130" cy="4387850"/>
                     </a:xfrm>
                     <a:prstGeom prst="rect">
                       <a:avLst/>
@@ -1072,11 +1065,14 @@
     <w:p/>
     <w:p>
       <w:r>
+        <w:rPr>
+          <w:noProof/>
+        </w:rPr>
         <w:drawing>
-          <wp:inline distT="0" distB="0" distL="0" distR="0" wp14:anchorId="47EC27F0" wp14:editId="3E1F9358">
-            <wp:extent cx="6120130" cy="1809750"/>
+          <wp:inline distT="0" distB="0" distL="0" distR="0" wp14:anchorId="7CDE46D5" wp14:editId="23FF07C6">
+            <wp:extent cx="6120130" cy="1374775"/>
             <wp:effectExtent l="0" t="0" r="0" b="0"/>
-            <wp:docPr id="6" name="Image 6"/>
+            <wp:docPr id="5" name="Image 5"/>
             <wp:cNvGraphicFramePr>
               <a:graphicFrameLocks xmlns:a="http://schemas.openxmlformats.org/drawingml/2006/main" noChangeAspect="1"/>
             </wp:cNvGraphicFramePr>
@@ -1096,7 +1092,7 @@
                   <pic:spPr>
                     <a:xfrm>
                       <a:off x="0" y="0"/>
-                      <a:ext cx="6120130" cy="1809750"/>
+                      <a:ext cx="6120130" cy="1374775"/>
                     </a:xfrm>
                     <a:prstGeom prst="rect">
                       <a:avLst/>
@@ -1112,14 +1108,14 @@
     <w:p/>
     <w:p>
       <w:r>
-        <w:t xml:space="preserve">Penser a valider </w:t>
-      </w:r>
-      <w:r>
+        <w:rPr>
+          <w:noProof/>
+        </w:rPr>
         <w:drawing>
-          <wp:inline distT="0" distB="0" distL="0" distR="0" wp14:anchorId="5AC37AA6" wp14:editId="18451FDA">
-            <wp:extent cx="1648055" cy="419158"/>
-            <wp:effectExtent l="0" t="0" r="9525" b="0"/>
-            <wp:docPr id="7" name="Image 7"/>
+          <wp:inline distT="0" distB="0" distL="0" distR="0" wp14:anchorId="47EC27F0" wp14:editId="3E1F9358">
+            <wp:extent cx="6120130" cy="1809750"/>
+            <wp:effectExtent l="0" t="0" r="0" b="0"/>
+            <wp:docPr id="6" name="Image 6"/>
             <wp:cNvGraphicFramePr>
               <a:graphicFrameLocks xmlns:a="http://schemas.openxmlformats.org/drawingml/2006/main" noChangeAspect="1"/>
             </wp:cNvGraphicFramePr>
@@ -1139,6 +1135,52 @@
                   <pic:spPr>
                     <a:xfrm>
                       <a:off x="0" y="0"/>
+                      <a:ext cx="6120130" cy="1809750"/>
+                    </a:xfrm>
+                    <a:prstGeom prst="rect">
+                      <a:avLst/>
+                    </a:prstGeom>
+                  </pic:spPr>
+                </pic:pic>
+              </a:graphicData>
+            </a:graphic>
+          </wp:inline>
+        </w:drawing>
+      </w:r>
+    </w:p>
+    <w:p/>
+    <w:p>
+      <w:r>
+        <w:t xml:space="preserve">Penser a valider </w:t>
+      </w:r>
+      <w:r>
+        <w:rPr>
+          <w:noProof/>
+        </w:rPr>
+        <w:drawing>
+          <wp:inline distT="0" distB="0" distL="0" distR="0" wp14:anchorId="5AC37AA6" wp14:editId="18451FDA">
+            <wp:extent cx="1648055" cy="419158"/>
+            <wp:effectExtent l="0" t="0" r="9525" b="0"/>
+            <wp:docPr id="7" name="Image 7"/>
+            <wp:cNvGraphicFramePr>
+              <a:graphicFrameLocks xmlns:a="http://schemas.openxmlformats.org/drawingml/2006/main" noChangeAspect="1"/>
+            </wp:cNvGraphicFramePr>
+            <a:graphic xmlns:a="http://schemas.openxmlformats.org/drawingml/2006/main">
+              <a:graphicData uri="http://schemas.openxmlformats.org/drawingml/2006/picture">
+                <pic:pic xmlns:pic="http://schemas.openxmlformats.org/drawingml/2006/picture">
+                  <pic:nvPicPr>
+                    <pic:cNvPr id="1" name=""/>
+                    <pic:cNvPicPr/>
+                  </pic:nvPicPr>
+                  <pic:blipFill>
+                    <a:blip r:embed="rId14"/>
+                    <a:stretch>
+                      <a:fillRect/>
+                    </a:stretch>
+                  </pic:blipFill>
+                  <pic:spPr>
+                    <a:xfrm>
+                      <a:off x="0" y="0"/>
                       <a:ext cx="1648055" cy="419158"/>
                     </a:xfrm>
                     <a:prstGeom prst="rect">
@@ -1163,10 +1205,7 @@
       </w:pPr>
       <w:r>
         <w:lastRenderedPageBreak/>
-        <w:t xml:space="preserve">5. </w:t>
-      </w:r>
-      <w:r>
-        <w:t>Disponibilités des Juges-Arbitres (E021)</w:t>
+        <w:t>5. Disponibilités des Juges-Arbitres (E021)</w:t>
       </w:r>
     </w:p>
     <w:tbl>
@@ -1191,12 +1230,6 @@
         <w:gridCol w:w="6126"/>
       </w:tblGrid>
       <w:tr>
-        <w:tblPrEx>
-          <w:tblCellMar>
-            <w:top w:w="0" w:type="dxa"/>
-            <w:bottom w:w="0" w:type="dxa"/>
-          </w:tblCellMar>
-        </w:tblPrEx>
         <w:tc>
           <w:tcPr>
             <w:tcW w:w="2900" w:type="dxa"/>
@@ -1256,12 +1289,6 @@
         </w:tc>
       </w:tr>
       <w:tr>
-        <w:tblPrEx>
-          <w:tblCellMar>
-            <w:top w:w="0" w:type="dxa"/>
-            <w:bottom w:w="0" w:type="dxa"/>
-          </w:tblCellMar>
-        </w:tblPrEx>
         <w:tc>
           <w:tcPr>
             <w:tcW w:w="2900" w:type="dxa"/>
@@ -1451,12 +1478,6 @@
         <w:gridCol w:w="9026"/>
       </w:tblGrid>
       <w:tr>
-        <w:tblPrEx>
-          <w:tblCellMar>
-            <w:top w:w="0" w:type="dxa"/>
-            <w:bottom w:w="0" w:type="dxa"/>
-          </w:tblCellMar>
-        </w:tblPrEx>
         <w:tc>
           <w:tcPr>
             <w:tcW w:w="0" w:type="auto"/>
@@ -1522,12 +1543,6 @@
         <w:gridCol w:w="9628"/>
       </w:tblGrid>
       <w:tr>
-        <w:tblPrEx>
-          <w:tblCellMar>
-            <w:top w:w="0" w:type="dxa"/>
-            <w:bottom w:w="0" w:type="dxa"/>
-          </w:tblCellMar>
-        </w:tblPrEx>
         <w:tc>
           <w:tcPr>
             <w:tcW w:w="0" w:type="auto"/>
@@ -1550,6 +1565,9 @@
               <w:jc w:val="center"/>
             </w:pPr>
             <w:r>
+              <w:rPr>
+                <w:noProof/>
+              </w:rPr>
               <w:drawing>
                 <wp:inline distT="0" distB="0" distL="0" distR="0" wp14:anchorId="2936EC42" wp14:editId="3B125E9E">
                   <wp:extent cx="6120130" cy="1922145"/>
@@ -1566,7 +1584,7 @@
                           <pic:cNvPicPr/>
                         </pic:nvPicPr>
                         <pic:blipFill>
-                          <a:blip r:embed="rId14"/>
+                          <a:blip r:embed="rId15"/>
                           <a:stretch>
                             <a:fillRect/>
                           </a:stretch>
@@ -1601,10 +1619,7 @@
       </w:pPr>
       <w:r>
         <w:lastRenderedPageBreak/>
-        <w:t>5</w:t>
-      </w:r>
-      <w:r>
-        <w:t>. Nomination des Juges-Arbitres (E022)</w:t>
+        <w:t>5. Nomination des Juges-Arbitres (E022)</w:t>
       </w:r>
     </w:p>
     <w:tbl>
@@ -1629,12 +1644,6 @@
         <w:gridCol w:w="6126"/>
       </w:tblGrid>
       <w:tr>
-        <w:tblPrEx>
-          <w:tblCellMar>
-            <w:top w:w="0" w:type="dxa"/>
-            <w:bottom w:w="0" w:type="dxa"/>
-          </w:tblCellMar>
-        </w:tblPrEx>
         <w:tc>
           <w:tcPr>
             <w:tcW w:w="2900" w:type="dxa"/>
@@ -1694,12 +1703,6 @@
         </w:tc>
       </w:tr>
       <w:tr>
-        <w:tblPrEx>
-          <w:tblCellMar>
-            <w:top w:w="0" w:type="dxa"/>
-            <w:bottom w:w="0" w:type="dxa"/>
-          </w:tblCellMar>
-        </w:tblPrEx>
         <w:tc>
           <w:tcPr>
             <w:tcW w:w="2900" w:type="dxa"/>
@@ -2004,6 +2007,61 @@
       </w:pPr>
       <w:r>
         <w:t>Chaque JA reçoit un email avec les détails de la rencontre et un lien vers sa convocation (E023).</w:t>
+      </w:r>
+    </w:p>
+    <w:p>
+      <w:pPr>
+        <w:spacing w:before="40" w:after="40"/>
+      </w:pPr>
+    </w:p>
+    <w:p>
+      <w:pPr>
+        <w:pStyle w:val="Titre3"/>
+      </w:pPr>
+      <w:r>
+        <w:t>Exemple</w:t>
+      </w:r>
+    </w:p>
+    <w:p>
+      <w:pPr>
+        <w:pStyle w:val="Titre3"/>
+      </w:pPr>
+      <w:r>
+        <w:drawing>
+          <wp:inline distT="0" distB="0" distL="0" distR="0" wp14:anchorId="695A5895" wp14:editId="2D117720">
+            <wp:extent cx="6120130" cy="2501265"/>
+            <wp:effectExtent l="0" t="0" r="0" b="0"/>
+            <wp:docPr id="12" name="Image 12"/>
+            <wp:cNvGraphicFramePr>
+              <a:graphicFrameLocks xmlns:a="http://schemas.openxmlformats.org/drawingml/2006/main" noChangeAspect="1"/>
+            </wp:cNvGraphicFramePr>
+            <a:graphic xmlns:a="http://schemas.openxmlformats.org/drawingml/2006/main">
+              <a:graphicData uri="http://schemas.openxmlformats.org/drawingml/2006/picture">
+                <pic:pic xmlns:pic="http://schemas.openxmlformats.org/drawingml/2006/picture">
+                  <pic:nvPicPr>
+                    <pic:cNvPr id="1" name=""/>
+                    <pic:cNvPicPr/>
+                  </pic:nvPicPr>
+                  <pic:blipFill>
+                    <a:blip r:embed="rId16"/>
+                    <a:stretch>
+                      <a:fillRect/>
+                    </a:stretch>
+                  </pic:blipFill>
+                  <pic:spPr>
+                    <a:xfrm>
+                      <a:off x="0" y="0"/>
+                      <a:ext cx="6120130" cy="2501265"/>
+                    </a:xfrm>
+                    <a:prstGeom prst="rect">
+                      <a:avLst/>
+                    </a:prstGeom>
+                  </pic:spPr>
+                </pic:pic>
+              </a:graphicData>
+            </a:graphic>
+          </wp:inline>
+        </w:drawing>
       </w:r>
     </w:p>
     <w:p>
@@ -2032,12 +2090,6 @@
         <w:gridCol w:w="9628"/>
       </w:tblGrid>
       <w:tr>
-        <w:tblPrEx>
-          <w:tblCellMar>
-            <w:top w:w="0" w:type="dxa"/>
-            <w:bottom w:w="0" w:type="dxa"/>
-          </w:tblCellMar>
-        </w:tblPrEx>
         <w:tc>
           <w:tcPr>
             <w:tcW w:w="0" w:type="auto"/>
@@ -2062,10 +2114,10 @@
             <w:r>
               <w:lastRenderedPageBreak/>
               <w:drawing>
-                <wp:inline distT="0" distB="0" distL="0" distR="0" wp14:anchorId="0EC4B185" wp14:editId="2ADAFB9B">
-                  <wp:extent cx="6120130" cy="2891155"/>
-                  <wp:effectExtent l="0" t="0" r="0" b="4445"/>
-                  <wp:docPr id="9" name="Image 9"/>
+                <wp:inline distT="0" distB="0" distL="0" distR="0" wp14:anchorId="14546EC8" wp14:editId="062A9C84">
+                  <wp:extent cx="6120130" cy="2875280"/>
+                  <wp:effectExtent l="0" t="0" r="0" b="1270"/>
+                  <wp:docPr id="10" name="Image 10"/>
                   <wp:cNvGraphicFramePr>
                     <a:graphicFrameLocks xmlns:a="http://schemas.openxmlformats.org/drawingml/2006/main" noChangeAspect="1"/>
                   </wp:cNvGraphicFramePr>
@@ -2077,7 +2129,7 @@
                           <pic:cNvPicPr/>
                         </pic:nvPicPr>
                         <pic:blipFill>
-                          <a:blip r:embed="rId15"/>
+                          <a:blip r:embed="rId17"/>
                           <a:stretch>
                             <a:fillRect/>
                           </a:stretch>
@@ -2085,7 +2137,7 @@
                         <pic:spPr>
                           <a:xfrm>
                             <a:off x="0" y="0"/>
-                            <a:ext cx="6120130" cy="2891155"/>
+                            <a:ext cx="6120130" cy="2875280"/>
                           </a:xfrm>
                           <a:prstGeom prst="rect">
                             <a:avLst/>
@@ -2112,10 +2164,7 @@
       </w:pPr>
       <w:r>
         <w:lastRenderedPageBreak/>
-        <w:t>6</w:t>
-      </w:r>
-      <w:r>
-        <w:t>. Convocation et frais JA (E023)</w:t>
+        <w:t>6. Convocation et frais JA (E023)</w:t>
       </w:r>
     </w:p>
     <w:tbl>
@@ -2140,12 +2189,6 @@
         <w:gridCol w:w="6126"/>
       </w:tblGrid>
       <w:tr>
-        <w:tblPrEx>
-          <w:tblCellMar>
-            <w:top w:w="0" w:type="dxa"/>
-            <w:bottom w:w="0" w:type="dxa"/>
-          </w:tblCellMar>
-        </w:tblPrEx>
         <w:tc>
           <w:tcPr>
             <w:tcW w:w="2900" w:type="dxa"/>
@@ -2205,12 +2248,6 @@
         </w:tc>
       </w:tr>
       <w:tr>
-        <w:tblPrEx>
-          <w:tblCellMar>
-            <w:top w:w="0" w:type="dxa"/>
-            <w:bottom w:w="0" w:type="dxa"/>
-          </w:tblCellMar>
-        </w:tblPrEx>
         <w:tc>
           <w:tcPr>
             <w:tcW w:w="2900" w:type="dxa"/>
@@ -2345,7 +2382,13 @@
         <w:spacing w:before="40" w:after="40"/>
       </w:pPr>
       <w:r>
-        <w:t>Distance calculée entre le domicile du JA et la salle.</w:t>
+        <w:t>Distance calculée entre le domicile du JA et la salle</w:t>
+      </w:r>
+      <w:r>
+        <w:t xml:space="preserve"> a vol d’oiseau</w:t>
+      </w:r>
+      <w:r>
+        <w:t>.</w:t>
       </w:r>
     </w:p>
     <w:p>
@@ -2452,12 +2495,6 @@
         <w:gridCol w:w="9026"/>
       </w:tblGrid>
       <w:tr>
-        <w:tblPrEx>
-          <w:tblCellMar>
-            <w:top w:w="0" w:type="dxa"/>
-            <w:bottom w:w="0" w:type="dxa"/>
-          </w:tblCellMar>
-        </w:tblPrEx>
         <w:tc>
           <w:tcPr>
             <w:tcW w:w="0" w:type="auto"/>
@@ -2491,12 +2528,36 @@
                 <w:sz w:val="19"/>
                 <w:szCs w:val="19"/>
               </w:rPr>
-              <w:t>Le lien de la convocation est envoyé automatiquement par email lors de l’envoi des convocations (E022). Le JA peut y accéder à tout moment depuis cet email.</w:t>
+              <w:t xml:space="preserve">Le lien de la convocation est envoyé automatiquement par email lors de l’envoi des </w:t>
+            </w:r>
+            <w:r>
+              <w:rPr>
+                <w:sz w:val="19"/>
+                <w:szCs w:val="19"/>
+              </w:rPr>
+              <w:t>convocations.</w:t>
+            </w:r>
+            <w:r>
+              <w:rPr>
+                <w:sz w:val="19"/>
+                <w:szCs w:val="19"/>
+              </w:rPr>
+              <w:t xml:space="preserve"> Le JA peut y accéder à tout moment depuis cet email.</w:t>
             </w:r>
           </w:p>
         </w:tc>
       </w:tr>
     </w:tbl>
+    <w:p>
+      <w:pPr>
+        <w:spacing w:before="80"/>
+      </w:pPr>
+    </w:p>
+    <w:p>
+      <w:r>
+        <w:br w:type="page"/>
+      </w:r>
+    </w:p>
     <w:p>
       <w:pPr>
         <w:spacing w:before="80"/>
@@ -2520,15 +2581,9 @@
         <w:tblLook w:val="04A0" w:firstRow="1" w:lastRow="0" w:firstColumn="1" w:lastColumn="0" w:noHBand="0" w:noVBand="1"/>
       </w:tblPr>
       <w:tblGrid>
-        <w:gridCol w:w="9026"/>
+        <w:gridCol w:w="9628"/>
       </w:tblGrid>
       <w:tr>
-        <w:tblPrEx>
-          <w:tblCellMar>
-            <w:top w:w="0" w:type="dxa"/>
-            <w:bottom w:w="0" w:type="dxa"/>
-          </w:tblCellMar>
-        </w:tblPrEx>
         <w:tc>
           <w:tcPr>
             <w:tcW w:w="0" w:type="auto"/>
@@ -2551,14 +2606,83 @@
               <w:jc w:val="center"/>
             </w:pPr>
             <w:r>
-              <w:rPr>
-                <w:i/>
-                <w:iCs/>
-                <w:color w:val="AAAAAA"/>
-                <w:sz w:val="19"/>
-                <w:szCs w:val="19"/>
-              </w:rPr>
-              <w:t>]</w:t>
+              <w:drawing>
+                <wp:inline distT="0" distB="0" distL="0" distR="0" wp14:anchorId="1438A10D" wp14:editId="0EE7331D">
+                  <wp:extent cx="6029325" cy="2291080"/>
+                  <wp:effectExtent l="0" t="0" r="9525" b="0"/>
+                  <wp:docPr id="13" name="Image 13"/>
+                  <wp:cNvGraphicFramePr>
+                    <a:graphicFrameLocks xmlns:a="http://schemas.openxmlformats.org/drawingml/2006/main" noChangeAspect="1"/>
+                  </wp:cNvGraphicFramePr>
+                  <a:graphic xmlns:a="http://schemas.openxmlformats.org/drawingml/2006/main">
+                    <a:graphicData uri="http://schemas.openxmlformats.org/drawingml/2006/picture">
+                      <pic:pic xmlns:pic="http://schemas.openxmlformats.org/drawingml/2006/picture">
+                        <pic:nvPicPr>
+                          <pic:cNvPr id="1" name=""/>
+                          <pic:cNvPicPr/>
+                        </pic:nvPicPr>
+                        <pic:blipFill>
+                          <a:blip r:embed="rId18"/>
+                          <a:stretch>
+                            <a:fillRect/>
+                          </a:stretch>
+                        </pic:blipFill>
+                        <pic:spPr>
+                          <a:xfrm>
+                            <a:off x="0" y="0"/>
+                            <a:ext cx="6029325" cy="2291080"/>
+                          </a:xfrm>
+                          <a:prstGeom prst="rect">
+                            <a:avLst/>
+                          </a:prstGeom>
+                        </pic:spPr>
+                      </pic:pic>
+                    </a:graphicData>
+                  </a:graphic>
+                </wp:inline>
+              </w:drawing>
+            </w:r>
+          </w:p>
+          <w:p>
+            <w:pPr>
+              <w:jc w:val="center"/>
+            </w:pPr>
+            <w:r>
+              <w:drawing>
+                <wp:inline distT="0" distB="0" distL="0" distR="0" wp14:anchorId="60BE01E8" wp14:editId="7844B3C3">
+                  <wp:extent cx="6038850" cy="1748155"/>
+                  <wp:effectExtent l="0" t="0" r="0" b="4445"/>
+                  <wp:docPr id="14" name="Image 14"/>
+                  <wp:cNvGraphicFramePr>
+                    <a:graphicFrameLocks xmlns:a="http://schemas.openxmlformats.org/drawingml/2006/main" noChangeAspect="1"/>
+                  </wp:cNvGraphicFramePr>
+                  <a:graphic xmlns:a="http://schemas.openxmlformats.org/drawingml/2006/main">
+                    <a:graphicData uri="http://schemas.openxmlformats.org/drawingml/2006/picture">
+                      <pic:pic xmlns:pic="http://schemas.openxmlformats.org/drawingml/2006/picture">
+                        <pic:nvPicPr>
+                          <pic:cNvPr id="1" name=""/>
+                          <pic:cNvPicPr/>
+                        </pic:nvPicPr>
+                        <pic:blipFill>
+                          <a:blip r:embed="rId19"/>
+                          <a:stretch>
+                            <a:fillRect/>
+                          </a:stretch>
+                        </pic:blipFill>
+                        <pic:spPr>
+                          <a:xfrm>
+                            <a:off x="0" y="0"/>
+                            <a:ext cx="6038850" cy="1748155"/>
+                          </a:xfrm>
+                          <a:prstGeom prst="rect">
+                            <a:avLst/>
+                          </a:prstGeom>
+                        </pic:spPr>
+                      </pic:pic>
+                    </a:graphicData>
+                  </a:graphic>
+                </wp:inline>
+              </w:drawing>
             </w:r>
           </w:p>
         </w:tc>
@@ -2575,7 +2699,7 @@
       </w:pPr>
       <w:r>
         <w:lastRenderedPageBreak/>
-        <w:t>. Centre d’envoi (E024)</w:t>
+        <w:t>7. Centre d’envoi (E024)</w:t>
       </w:r>
     </w:p>
     <w:tbl>
@@ -2600,12 +2724,6 @@
         <w:gridCol w:w="6126"/>
       </w:tblGrid>
       <w:tr>
-        <w:tblPrEx>
-          <w:tblCellMar>
-            <w:top w:w="0" w:type="dxa"/>
-            <w:bottom w:w="0" w:type="dxa"/>
-          </w:tblCellMar>
-        </w:tblPrEx>
         <w:tc>
           <w:tcPr>
             <w:tcW w:w="2900" w:type="dxa"/>
@@ -2665,12 +2783,6 @@
         </w:tc>
       </w:tr>
       <w:tr>
-        <w:tblPrEx>
-          <w:tblCellMar>
-            <w:top w:w="0" w:type="dxa"/>
-            <w:bottom w:w="0" w:type="dxa"/>
-          </w:tblCellMar>
-        </w:tblPrEx>
         <w:tc>
           <w:tcPr>
             <w:tcW w:w="2900" w:type="dxa"/>
@@ -2783,12 +2895,6 @@
         <w:gridCol w:w="6626"/>
       </w:tblGrid>
       <w:tr>
-        <w:tblPrEx>
-          <w:tblCellMar>
-            <w:top w:w="0" w:type="dxa"/>
-            <w:bottom w:w="0" w:type="dxa"/>
-          </w:tblCellMar>
-        </w:tblPrEx>
         <w:tc>
           <w:tcPr>
             <w:tcW w:w="2400" w:type="dxa"/>
@@ -2851,12 +2957,6 @@
         </w:tc>
       </w:tr>
       <w:tr>
-        <w:tblPrEx>
-          <w:tblCellMar>
-            <w:top w:w="0" w:type="dxa"/>
-            <w:bottom w:w="0" w:type="dxa"/>
-          </w:tblCellMar>
-        </w:tblPrEx>
         <w:tc>
           <w:tcPr>
             <w:tcW w:w="2400" w:type="dxa"/>
@@ -2916,12 +3016,6 @@
         </w:tc>
       </w:tr>
       <w:tr>
-        <w:tblPrEx>
-          <w:tblCellMar>
-            <w:top w:w="0" w:type="dxa"/>
-            <w:bottom w:w="0" w:type="dxa"/>
-          </w:tblCellMar>
-        </w:tblPrEx>
         <w:tc>
           <w:tcPr>
             <w:tcW w:w="2400" w:type="dxa"/>
@@ -2981,12 +3075,6 @@
         </w:tc>
       </w:tr>
       <w:tr>
-        <w:tblPrEx>
-          <w:tblCellMar>
-            <w:top w:w="0" w:type="dxa"/>
-            <w:bottom w:w="0" w:type="dxa"/>
-          </w:tblCellMar>
-        </w:tblPrEx>
         <w:tc>
           <w:tcPr>
             <w:tcW w:w="2400" w:type="dxa"/>
@@ -3046,12 +3134,6 @@
         </w:tc>
       </w:tr>
       <w:tr>
-        <w:tblPrEx>
-          <w:tblCellMar>
-            <w:top w:w="0" w:type="dxa"/>
-            <w:bottom w:w="0" w:type="dxa"/>
-          </w:tblCellMar>
-        </w:tblPrEx>
         <w:tc>
           <w:tcPr>
             <w:tcW w:w="2400" w:type="dxa"/>
@@ -3254,12 +3336,6 @@
         <w:gridCol w:w="9026"/>
       </w:tblGrid>
       <w:tr>
-        <w:tblPrEx>
-          <w:tblCellMar>
-            <w:top w:w="0" w:type="dxa"/>
-            <w:bottom w:w="0" w:type="dxa"/>
-          </w:tblCellMar>
-        </w:tblPrEx>
         <w:tc>
           <w:tcPr>
             <w:tcW w:w="0" w:type="auto"/>
@@ -3336,15 +3412,9 @@
         <w:tblLook w:val="04A0" w:firstRow="1" w:lastRow="0" w:firstColumn="1" w:lastColumn="0" w:noHBand="0" w:noVBand="1"/>
       </w:tblPr>
       <w:tblGrid>
-        <w:gridCol w:w="9026"/>
+        <w:gridCol w:w="9628"/>
       </w:tblGrid>
       <w:tr>
-        <w:tblPrEx>
-          <w:tblCellMar>
-            <w:top w:w="0" w:type="dxa"/>
-            <w:bottom w:w="0" w:type="dxa"/>
-          </w:tblCellMar>
-        </w:tblPrEx>
         <w:tc>
           <w:tcPr>
             <w:tcW w:w="0" w:type="auto"/>
@@ -3367,14 +3437,42 @@
               <w:jc w:val="center"/>
             </w:pPr>
             <w:r>
-              <w:rPr>
-                <w:i/>
-                <w:iCs/>
-                <w:color w:val="AAAAAA"/>
-                <w:sz w:val="19"/>
-                <w:szCs w:val="19"/>
-              </w:rPr>
-              <w:t>[ Copie d’écran à insérer ]</w:t>
+              <w:lastRenderedPageBreak/>
+              <w:drawing>
+                <wp:inline distT="0" distB="0" distL="0" distR="0" wp14:anchorId="79032C7B" wp14:editId="09CE7621">
+                  <wp:extent cx="6120130" cy="2890520"/>
+                  <wp:effectExtent l="0" t="0" r="0" b="5080"/>
+                  <wp:docPr id="11" name="Image 11"/>
+                  <wp:cNvGraphicFramePr>
+                    <a:graphicFrameLocks xmlns:a="http://schemas.openxmlformats.org/drawingml/2006/main" noChangeAspect="1"/>
+                  </wp:cNvGraphicFramePr>
+                  <a:graphic xmlns:a="http://schemas.openxmlformats.org/drawingml/2006/main">
+                    <a:graphicData uri="http://schemas.openxmlformats.org/drawingml/2006/picture">
+                      <pic:pic xmlns:pic="http://schemas.openxmlformats.org/drawingml/2006/picture">
+                        <pic:nvPicPr>
+                          <pic:cNvPr id="1" name=""/>
+                          <pic:cNvPicPr/>
+                        </pic:nvPicPr>
+                        <pic:blipFill>
+                          <a:blip r:embed="rId20"/>
+                          <a:stretch>
+                            <a:fillRect/>
+                          </a:stretch>
+                        </pic:blipFill>
+                        <pic:spPr>
+                          <a:xfrm>
+                            <a:off x="0" y="0"/>
+                            <a:ext cx="6120130" cy="2890520"/>
+                          </a:xfrm>
+                          <a:prstGeom prst="rect">
+                            <a:avLst/>
+                          </a:prstGeom>
+                        </pic:spPr>
+                      </pic:pic>
+                    </a:graphicData>
+                  </a:graphic>
+                </wp:inline>
+              </w:drawing>
             </w:r>
           </w:p>
         </w:tc>
@@ -3391,7 +3489,7 @@
       </w:pPr>
       <w:r>
         <w:lastRenderedPageBreak/>
-        <w:t>7. Modèles de messages (E016)</w:t>
+        <w:t>8. Modèles de messages (E016)</w:t>
       </w:r>
     </w:p>
     <w:tbl>
@@ -3416,12 +3514,6 @@
         <w:gridCol w:w="6126"/>
       </w:tblGrid>
       <w:tr>
-        <w:tblPrEx>
-          <w:tblCellMar>
-            <w:top w:w="0" w:type="dxa"/>
-            <w:bottom w:w="0" w:type="dxa"/>
-          </w:tblCellMar>
-        </w:tblPrEx>
         <w:tc>
           <w:tcPr>
             <w:tcW w:w="2900" w:type="dxa"/>
@@ -3481,12 +3573,6 @@
         </w:tc>
       </w:tr>
       <w:tr>
-        <w:tblPrEx>
-          <w:tblCellMar>
-            <w:top w:w="0" w:type="dxa"/>
-            <w:bottom w:w="0" w:type="dxa"/>
-          </w:tblCellMar>
-        </w:tblPrEx>
         <w:tc>
           <w:tcPr>
             <w:tcW w:w="2900" w:type="dxa"/>
@@ -3819,12 +3905,6 @@
         <w:gridCol w:w="9026"/>
       </w:tblGrid>
       <w:tr>
-        <w:tblPrEx>
-          <w:tblCellMar>
-            <w:top w:w="0" w:type="dxa"/>
-            <w:bottom w:w="0" w:type="dxa"/>
-          </w:tblCellMar>
-        </w:tblPrEx>
         <w:tc>
           <w:tcPr>
             <w:tcW w:w="0" w:type="auto"/>
@@ -3887,15 +3967,9 @@
         <w:tblLook w:val="04A0" w:firstRow="1" w:lastRow="0" w:firstColumn="1" w:lastColumn="0" w:noHBand="0" w:noVBand="1"/>
       </w:tblPr>
       <w:tblGrid>
-        <w:gridCol w:w="9026"/>
+        <w:gridCol w:w="9628"/>
       </w:tblGrid>
       <w:tr>
-        <w:tblPrEx>
-          <w:tblCellMar>
-            <w:top w:w="0" w:type="dxa"/>
-            <w:bottom w:w="0" w:type="dxa"/>
-          </w:tblCellMar>
-        </w:tblPrEx>
         <w:tc>
           <w:tcPr>
             <w:tcW w:w="0" w:type="auto"/>
@@ -3918,735 +3992,42 @@
               <w:jc w:val="center"/>
             </w:pPr>
             <w:r>
-              <w:rPr>
-                <w:i/>
-                <w:iCs/>
-                <w:color w:val="AAAAAA"/>
-                <w:sz w:val="19"/>
-                <w:szCs w:val="19"/>
-              </w:rPr>
-              <w:t>[ Copie d’écran à insérer ]</w:t>
-            </w:r>
-          </w:p>
-        </w:tc>
-      </w:tr>
-    </w:tbl>
-    <w:p>
-      <w:pPr>
-        <w:pStyle w:val="Titre2"/>
-        <w:pageBreakBefore/>
-        <w:pBdr>
-          <w:bottom w:val="single" w:sz="6" w:space="2" w:color="2557A7"/>
-        </w:pBdr>
-        <w:spacing w:before="0"/>
-      </w:pPr>
-      <w:r>
-        <w:lastRenderedPageBreak/>
-        <w:t>8. Récapitulatif du processus de nomination</w:t>
-      </w:r>
-    </w:p>
-    <w:p>
-      <w:pPr>
-        <w:spacing w:before="60" w:after="60"/>
-      </w:pPr>
-      <w:r>
-        <w:t>Voici le déroulé complet d’une journée de nomination, de la vérification des disponibilités à l’envoi des convocations :</w:t>
-      </w:r>
-    </w:p>
-    <w:p>
-      <w:pPr>
-        <w:spacing w:before="80"/>
-      </w:pPr>
-    </w:p>
-    <w:tbl>
-      <w:tblPr>
-        <w:tblW w:w="9026" w:type="dxa"/>
-        <w:tblBorders>
-          <w:top w:val="single" w:sz="4" w:space="0" w:color="auto"/>
-          <w:left w:val="single" w:sz="4" w:space="0" w:color="auto"/>
-          <w:bottom w:val="single" w:sz="4" w:space="0" w:color="auto"/>
-          <w:right w:val="single" w:sz="4" w:space="0" w:color="auto"/>
-          <w:insideH w:val="single" w:sz="4" w:space="0" w:color="auto"/>
-          <w:insideV w:val="single" w:sz="4" w:space="0" w:color="auto"/>
-        </w:tblBorders>
-        <w:tblCellMar>
-          <w:left w:w="10" w:type="dxa"/>
-          <w:right w:w="10" w:type="dxa"/>
-        </w:tblCellMar>
-        <w:tblLook w:val="04A0" w:firstRow="1" w:lastRow="0" w:firstColumn="1" w:lastColumn="0" w:noHBand="0" w:noVBand="1"/>
-      </w:tblPr>
-      <w:tblGrid>
-        <w:gridCol w:w="800"/>
-        <w:gridCol w:w="2500"/>
-        <w:gridCol w:w="5726"/>
-      </w:tblGrid>
-      <w:tr>
-        <w:tblPrEx>
-          <w:tblCellMar>
-            <w:top w:w="0" w:type="dxa"/>
-            <w:bottom w:w="0" w:type="dxa"/>
-          </w:tblCellMar>
-        </w:tblPrEx>
-        <w:tc>
-          <w:tcPr>
-            <w:tcW w:w="800" w:type="dxa"/>
-            <w:tcBorders>
-              <w:top w:val="single" w:sz="4" w:space="0" w:color="C8D4E8"/>
-              <w:left w:val="single" w:sz="4" w:space="0" w:color="C8D4E8"/>
-              <w:bottom w:val="single" w:sz="4" w:space="0" w:color="C8D4E8"/>
-              <w:right w:val="single" w:sz="4" w:space="0" w:color="C8D4E8"/>
-            </w:tcBorders>
-            <w:shd w:val="clear" w:color="auto" w:fill="1A3A6B"/>
-            <w:tcMar>
-              <w:top w:w="80" w:type="dxa"/>
-              <w:left w:w="120" w:type="dxa"/>
-              <w:bottom w:w="80" w:type="dxa"/>
-              <w:right w:w="120" w:type="dxa"/>
-            </w:tcMar>
-          </w:tcPr>
-          <w:p>
-            <w:pPr>
-              <w:jc w:val="center"/>
-            </w:pPr>
-            <w:r>
-              <w:rPr>
-                <w:b/>
-                <w:bCs/>
-                <w:color w:val="FFFFFF"/>
-                <w:sz w:val="19"/>
-                <w:szCs w:val="19"/>
-              </w:rPr>
-              <w:t>Étape</w:t>
-            </w:r>
-          </w:p>
-        </w:tc>
-        <w:tc>
-          <w:tcPr>
-            <w:tcW w:w="2500" w:type="dxa"/>
-            <w:tcBorders>
-              <w:top w:val="single" w:sz="4" w:space="0" w:color="C8D4E8"/>
-              <w:left w:val="single" w:sz="4" w:space="0" w:color="C8D4E8"/>
-              <w:bottom w:val="single" w:sz="4" w:space="0" w:color="C8D4E8"/>
-              <w:right w:val="single" w:sz="4" w:space="0" w:color="C8D4E8"/>
-            </w:tcBorders>
-            <w:shd w:val="clear" w:color="auto" w:fill="1A3A6B"/>
-            <w:tcMar>
-              <w:top w:w="80" w:type="dxa"/>
-              <w:left w:w="120" w:type="dxa"/>
-              <w:bottom w:w="80" w:type="dxa"/>
-              <w:right w:w="120" w:type="dxa"/>
-            </w:tcMar>
-          </w:tcPr>
-          <w:p>
-            <w:r>
-              <w:rPr>
-                <w:b/>
-                <w:bCs/>
-                <w:color w:val="FFFFFF"/>
-                <w:sz w:val="19"/>
-                <w:szCs w:val="19"/>
-              </w:rPr>
-              <w:t>Écran</w:t>
-            </w:r>
-          </w:p>
-        </w:tc>
-        <w:tc>
-          <w:tcPr>
-            <w:tcW w:w="5726" w:type="dxa"/>
-            <w:tcBorders>
-              <w:top w:val="single" w:sz="4" w:space="0" w:color="C8D4E8"/>
-              <w:left w:val="single" w:sz="4" w:space="0" w:color="C8D4E8"/>
-              <w:bottom w:val="single" w:sz="4" w:space="0" w:color="C8D4E8"/>
-              <w:right w:val="single" w:sz="4" w:space="0" w:color="C8D4E8"/>
-            </w:tcBorders>
-            <w:shd w:val="clear" w:color="auto" w:fill="1A3A6B"/>
-            <w:tcMar>
-              <w:top w:w="80" w:type="dxa"/>
-              <w:left w:w="120" w:type="dxa"/>
-              <w:bottom w:w="80" w:type="dxa"/>
-              <w:right w:w="120" w:type="dxa"/>
-            </w:tcMar>
-          </w:tcPr>
-          <w:p>
-            <w:r>
-              <w:rPr>
-                <w:b/>
-                <w:bCs/>
-                <w:color w:val="FFFFFF"/>
-                <w:sz w:val="19"/>
-                <w:szCs w:val="19"/>
-              </w:rPr>
-              <w:t>Action</w:t>
-            </w:r>
-          </w:p>
-        </w:tc>
-      </w:tr>
-      <w:tr>
-        <w:tblPrEx>
-          <w:tblCellMar>
-            <w:top w:w="0" w:type="dxa"/>
-            <w:bottom w:w="0" w:type="dxa"/>
-          </w:tblCellMar>
-        </w:tblPrEx>
-        <w:tc>
-          <w:tcPr>
-            <w:tcW w:w="800" w:type="dxa"/>
-            <w:tcBorders>
-              <w:top w:val="single" w:sz="4" w:space="0" w:color="C8D4E8"/>
-              <w:left w:val="single" w:sz="4" w:space="0" w:color="C8D4E8"/>
-              <w:bottom w:val="single" w:sz="4" w:space="0" w:color="C8D4E8"/>
-              <w:right w:val="single" w:sz="4" w:space="0" w:color="C8D4E8"/>
-            </w:tcBorders>
-            <w:shd w:val="clear" w:color="auto" w:fill="F5F8FF"/>
-            <w:tcMar>
-              <w:top w:w="70" w:type="dxa"/>
-              <w:left w:w="120" w:type="dxa"/>
-              <w:bottom w:w="70" w:type="dxa"/>
-              <w:right w:w="120" w:type="dxa"/>
-            </w:tcMar>
-          </w:tcPr>
-          <w:p>
-            <w:pPr>
-              <w:jc w:val="center"/>
-            </w:pPr>
-            <w:r>
-              <w:rPr>
-                <w:b/>
-                <w:bCs/>
-                <w:color w:val="1A3A6B"/>
-                <w:sz w:val="19"/>
-                <w:szCs w:val="19"/>
-              </w:rPr>
-              <w:t>1</w:t>
-            </w:r>
-          </w:p>
-        </w:tc>
-        <w:tc>
-          <w:tcPr>
-            <w:tcW w:w="2500" w:type="dxa"/>
-            <w:tcBorders>
-              <w:top w:val="single" w:sz="4" w:space="0" w:color="C8D4E8"/>
-              <w:left w:val="single" w:sz="4" w:space="0" w:color="C8D4E8"/>
-              <w:bottom w:val="single" w:sz="4" w:space="0" w:color="C8D4E8"/>
-              <w:right w:val="single" w:sz="4" w:space="0" w:color="C8D4E8"/>
-            </w:tcBorders>
-            <w:shd w:val="clear" w:color="auto" w:fill="F5F8FF"/>
-            <w:tcMar>
-              <w:top w:w="70" w:type="dxa"/>
-              <w:left w:w="120" w:type="dxa"/>
-              <w:bottom w:w="70" w:type="dxa"/>
-              <w:right w:w="120" w:type="dxa"/>
-            </w:tcMar>
-          </w:tcPr>
-          <w:p>
-            <w:r>
-              <w:rPr>
-                <w:sz w:val="19"/>
-                <w:szCs w:val="19"/>
-              </w:rPr>
-              <w:t>Centre d’envoi (E024)</w:t>
-            </w:r>
-          </w:p>
-        </w:tc>
-        <w:tc>
-          <w:tcPr>
-            <w:tcW w:w="5726" w:type="dxa"/>
-            <w:tcBorders>
-              <w:top w:val="single" w:sz="4" w:space="0" w:color="C8D4E8"/>
-              <w:left w:val="single" w:sz="4" w:space="0" w:color="C8D4E8"/>
-              <w:bottom w:val="single" w:sz="4" w:space="0" w:color="C8D4E8"/>
-              <w:right w:val="single" w:sz="4" w:space="0" w:color="C8D4E8"/>
-            </w:tcBorders>
-            <w:shd w:val="clear" w:color="auto" w:fill="F5F8FF"/>
-            <w:tcMar>
-              <w:top w:w="70" w:type="dxa"/>
-              <w:left w:w="120" w:type="dxa"/>
-              <w:bottom w:w="70" w:type="dxa"/>
-              <w:right w:w="120" w:type="dxa"/>
-            </w:tcMar>
-          </w:tcPr>
-          <w:p>
-            <w:r>
-              <w:rPr>
-                <w:sz w:val="19"/>
-                <w:szCs w:val="19"/>
-              </w:rPr>
-              <w:t>Envoyer le message « Disponibilités » pour demander aux JA de déclarer leurs disponibilités.</w:t>
-            </w:r>
-          </w:p>
-        </w:tc>
-      </w:tr>
-      <w:tr>
-        <w:tblPrEx>
-          <w:tblCellMar>
-            <w:top w:w="0" w:type="dxa"/>
-            <w:bottom w:w="0" w:type="dxa"/>
-          </w:tblCellMar>
-        </w:tblPrEx>
-        <w:tc>
-          <w:tcPr>
-            <w:tcW w:w="800" w:type="dxa"/>
-            <w:tcBorders>
-              <w:top w:val="single" w:sz="4" w:space="0" w:color="C8D4E8"/>
-              <w:left w:val="single" w:sz="4" w:space="0" w:color="C8D4E8"/>
-              <w:bottom w:val="single" w:sz="4" w:space="0" w:color="C8D4E8"/>
-              <w:right w:val="single" w:sz="4" w:space="0" w:color="C8D4E8"/>
-            </w:tcBorders>
-            <w:shd w:val="clear" w:color="auto" w:fill="FFFFFF"/>
-            <w:tcMar>
-              <w:top w:w="70" w:type="dxa"/>
-              <w:left w:w="120" w:type="dxa"/>
-              <w:bottom w:w="70" w:type="dxa"/>
-              <w:right w:w="120" w:type="dxa"/>
-            </w:tcMar>
-          </w:tcPr>
-          <w:p>
-            <w:pPr>
-              <w:jc w:val="center"/>
-            </w:pPr>
-            <w:r>
-              <w:rPr>
-                <w:b/>
-                <w:bCs/>
-                <w:color w:val="1A3A6B"/>
-                <w:sz w:val="19"/>
-                <w:szCs w:val="19"/>
-              </w:rPr>
-              <w:t>2</w:t>
-            </w:r>
-          </w:p>
-        </w:tc>
-        <w:tc>
-          <w:tcPr>
-            <w:tcW w:w="2500" w:type="dxa"/>
-            <w:tcBorders>
-              <w:top w:val="single" w:sz="4" w:space="0" w:color="C8D4E8"/>
-              <w:left w:val="single" w:sz="4" w:space="0" w:color="C8D4E8"/>
-              <w:bottom w:val="single" w:sz="4" w:space="0" w:color="C8D4E8"/>
-              <w:right w:val="single" w:sz="4" w:space="0" w:color="C8D4E8"/>
-            </w:tcBorders>
-            <w:shd w:val="clear" w:color="auto" w:fill="FFFFFF"/>
-            <w:tcMar>
-              <w:top w:w="70" w:type="dxa"/>
-              <w:left w:w="120" w:type="dxa"/>
-              <w:bottom w:w="70" w:type="dxa"/>
-              <w:right w:w="120" w:type="dxa"/>
-            </w:tcMar>
-          </w:tcPr>
-          <w:p>
-            <w:r>
-              <w:rPr>
-                <w:sz w:val="19"/>
-                <w:szCs w:val="19"/>
-              </w:rPr>
-              <w:t>Disponibilités (E021)</w:t>
-            </w:r>
-          </w:p>
-        </w:tc>
-        <w:tc>
-          <w:tcPr>
-            <w:tcW w:w="5726" w:type="dxa"/>
-            <w:tcBorders>
-              <w:top w:val="single" w:sz="4" w:space="0" w:color="C8D4E8"/>
-              <w:left w:val="single" w:sz="4" w:space="0" w:color="C8D4E8"/>
-              <w:bottom w:val="single" w:sz="4" w:space="0" w:color="C8D4E8"/>
-              <w:right w:val="single" w:sz="4" w:space="0" w:color="C8D4E8"/>
-            </w:tcBorders>
-            <w:shd w:val="clear" w:color="auto" w:fill="FFFFFF"/>
-            <w:tcMar>
-              <w:top w:w="70" w:type="dxa"/>
-              <w:left w:w="120" w:type="dxa"/>
-              <w:bottom w:w="70" w:type="dxa"/>
-              <w:right w:w="120" w:type="dxa"/>
-            </w:tcMar>
-          </w:tcPr>
-          <w:p>
-            <w:r>
-              <w:rPr>
-                <w:sz w:val="19"/>
-                <w:szCs w:val="19"/>
-              </w:rPr>
-              <w:t>Vérifier que tous les JA ont déclaré leurs disponibilités (pas d’avatar rouge).</w:t>
-            </w:r>
-          </w:p>
-        </w:tc>
-      </w:tr>
-      <w:tr>
-        <w:tblPrEx>
-          <w:tblCellMar>
-            <w:top w:w="0" w:type="dxa"/>
-            <w:bottom w:w="0" w:type="dxa"/>
-          </w:tblCellMar>
-        </w:tblPrEx>
-        <w:tc>
-          <w:tcPr>
-            <w:tcW w:w="800" w:type="dxa"/>
-            <w:tcBorders>
-              <w:top w:val="single" w:sz="4" w:space="0" w:color="C8D4E8"/>
-              <w:left w:val="single" w:sz="4" w:space="0" w:color="C8D4E8"/>
-              <w:bottom w:val="single" w:sz="4" w:space="0" w:color="C8D4E8"/>
-              <w:right w:val="single" w:sz="4" w:space="0" w:color="C8D4E8"/>
-            </w:tcBorders>
-            <w:shd w:val="clear" w:color="auto" w:fill="F5F8FF"/>
-            <w:tcMar>
-              <w:top w:w="70" w:type="dxa"/>
-              <w:left w:w="120" w:type="dxa"/>
-              <w:bottom w:w="70" w:type="dxa"/>
-              <w:right w:w="120" w:type="dxa"/>
-            </w:tcMar>
-          </w:tcPr>
-          <w:p>
-            <w:pPr>
-              <w:jc w:val="center"/>
-            </w:pPr>
-            <w:r>
-              <w:rPr>
-                <w:b/>
-                <w:bCs/>
-                <w:color w:val="1A3A6B"/>
-                <w:sz w:val="19"/>
-                <w:szCs w:val="19"/>
-              </w:rPr>
-              <w:t>3</w:t>
-            </w:r>
-          </w:p>
-        </w:tc>
-        <w:tc>
-          <w:tcPr>
-            <w:tcW w:w="2500" w:type="dxa"/>
-            <w:tcBorders>
-              <w:top w:val="single" w:sz="4" w:space="0" w:color="C8D4E8"/>
-              <w:left w:val="single" w:sz="4" w:space="0" w:color="C8D4E8"/>
-              <w:bottom w:val="single" w:sz="4" w:space="0" w:color="C8D4E8"/>
-              <w:right w:val="single" w:sz="4" w:space="0" w:color="C8D4E8"/>
-            </w:tcBorders>
-            <w:shd w:val="clear" w:color="auto" w:fill="F5F8FF"/>
-            <w:tcMar>
-              <w:top w:w="70" w:type="dxa"/>
-              <w:left w:w="120" w:type="dxa"/>
-              <w:bottom w:w="70" w:type="dxa"/>
-              <w:right w:w="120" w:type="dxa"/>
-            </w:tcMar>
-          </w:tcPr>
-          <w:p>
-            <w:r>
-              <w:rPr>
-                <w:sz w:val="19"/>
-                <w:szCs w:val="19"/>
-              </w:rPr>
-              <w:t>Centre d’envoi (E024)</w:t>
-            </w:r>
-          </w:p>
-        </w:tc>
-        <w:tc>
-          <w:tcPr>
-            <w:tcW w:w="5726" w:type="dxa"/>
-            <w:tcBorders>
-              <w:top w:val="single" w:sz="4" w:space="0" w:color="C8D4E8"/>
-              <w:left w:val="single" w:sz="4" w:space="0" w:color="C8D4E8"/>
-              <w:bottom w:val="single" w:sz="4" w:space="0" w:color="C8D4E8"/>
-              <w:right w:val="single" w:sz="4" w:space="0" w:color="C8D4E8"/>
-            </w:tcBorders>
-            <w:shd w:val="clear" w:color="auto" w:fill="F5F8FF"/>
-            <w:tcMar>
-              <w:top w:w="70" w:type="dxa"/>
-              <w:left w:w="120" w:type="dxa"/>
-              <w:bottom w:w="70" w:type="dxa"/>
-              <w:right w:w="120" w:type="dxa"/>
-            </w:tcMar>
-          </w:tcPr>
-          <w:p>
-            <w:r>
-              <w:rPr>
-                <w:sz w:val="19"/>
-                <w:szCs w:val="19"/>
-              </w:rPr>
-              <w:t>Si des JA n’ont pas répondu, envoyer un « Rappel dispo ».</w:t>
-            </w:r>
-          </w:p>
-        </w:tc>
-      </w:tr>
-      <w:tr>
-        <w:tblPrEx>
-          <w:tblCellMar>
-            <w:top w:w="0" w:type="dxa"/>
-            <w:bottom w:w="0" w:type="dxa"/>
-          </w:tblCellMar>
-        </w:tblPrEx>
-        <w:tc>
-          <w:tcPr>
-            <w:tcW w:w="800" w:type="dxa"/>
-            <w:tcBorders>
-              <w:top w:val="single" w:sz="4" w:space="0" w:color="C8D4E8"/>
-              <w:left w:val="single" w:sz="4" w:space="0" w:color="C8D4E8"/>
-              <w:bottom w:val="single" w:sz="4" w:space="0" w:color="C8D4E8"/>
-              <w:right w:val="single" w:sz="4" w:space="0" w:color="C8D4E8"/>
-            </w:tcBorders>
-            <w:shd w:val="clear" w:color="auto" w:fill="FFFFFF"/>
-            <w:tcMar>
-              <w:top w:w="70" w:type="dxa"/>
-              <w:left w:w="120" w:type="dxa"/>
-              <w:bottom w:w="70" w:type="dxa"/>
-              <w:right w:w="120" w:type="dxa"/>
-            </w:tcMar>
-          </w:tcPr>
-          <w:p>
-            <w:pPr>
-              <w:jc w:val="center"/>
-            </w:pPr>
-            <w:r>
-              <w:rPr>
-                <w:b/>
-                <w:bCs/>
-                <w:color w:val="1A3A6B"/>
-                <w:sz w:val="19"/>
-                <w:szCs w:val="19"/>
-              </w:rPr>
-              <w:t>4</w:t>
-            </w:r>
-          </w:p>
-        </w:tc>
-        <w:tc>
-          <w:tcPr>
-            <w:tcW w:w="2500" w:type="dxa"/>
-            <w:tcBorders>
-              <w:top w:val="single" w:sz="4" w:space="0" w:color="C8D4E8"/>
-              <w:left w:val="single" w:sz="4" w:space="0" w:color="C8D4E8"/>
-              <w:bottom w:val="single" w:sz="4" w:space="0" w:color="C8D4E8"/>
-              <w:right w:val="single" w:sz="4" w:space="0" w:color="C8D4E8"/>
-            </w:tcBorders>
-            <w:shd w:val="clear" w:color="auto" w:fill="FFFFFF"/>
-            <w:tcMar>
-              <w:top w:w="70" w:type="dxa"/>
-              <w:left w:w="120" w:type="dxa"/>
-              <w:bottom w:w="70" w:type="dxa"/>
-              <w:right w:w="120" w:type="dxa"/>
-            </w:tcMar>
-          </w:tcPr>
-          <w:p>
-            <w:r>
-              <w:rPr>
-                <w:sz w:val="19"/>
-                <w:szCs w:val="19"/>
-              </w:rPr>
-              <w:t>Nomination (E022)</w:t>
-            </w:r>
-          </w:p>
-        </w:tc>
-        <w:tc>
-          <w:tcPr>
-            <w:tcW w:w="5726" w:type="dxa"/>
-            <w:tcBorders>
-              <w:top w:val="single" w:sz="4" w:space="0" w:color="C8D4E8"/>
-              <w:left w:val="single" w:sz="4" w:space="0" w:color="C8D4E8"/>
-              <w:bottom w:val="single" w:sz="4" w:space="0" w:color="C8D4E8"/>
-              <w:right w:val="single" w:sz="4" w:space="0" w:color="C8D4E8"/>
-            </w:tcBorders>
-            <w:shd w:val="clear" w:color="auto" w:fill="FFFFFF"/>
-            <w:tcMar>
-              <w:top w:w="70" w:type="dxa"/>
-              <w:left w:w="120" w:type="dxa"/>
-              <w:bottom w:w="70" w:type="dxa"/>
-              <w:right w:w="120" w:type="dxa"/>
-            </w:tcMar>
-          </w:tcPr>
-          <w:p>
-            <w:r>
-              <w:rPr>
-                <w:sz w:val="19"/>
-                <w:szCs w:val="19"/>
-              </w:rPr>
-              <w:t>Lancer la nomination automatique et vérifier / corriger manuellement si besoin.</w:t>
-            </w:r>
-          </w:p>
-        </w:tc>
-      </w:tr>
-      <w:tr>
-        <w:tblPrEx>
-          <w:tblCellMar>
-            <w:top w:w="0" w:type="dxa"/>
-            <w:bottom w:w="0" w:type="dxa"/>
-          </w:tblCellMar>
-        </w:tblPrEx>
-        <w:tc>
-          <w:tcPr>
-            <w:tcW w:w="800" w:type="dxa"/>
-            <w:tcBorders>
-              <w:top w:val="single" w:sz="4" w:space="0" w:color="C8D4E8"/>
-              <w:left w:val="single" w:sz="4" w:space="0" w:color="C8D4E8"/>
-              <w:bottom w:val="single" w:sz="4" w:space="0" w:color="C8D4E8"/>
-              <w:right w:val="single" w:sz="4" w:space="0" w:color="C8D4E8"/>
-            </w:tcBorders>
-            <w:shd w:val="clear" w:color="auto" w:fill="F5F8FF"/>
-            <w:tcMar>
-              <w:top w:w="70" w:type="dxa"/>
-              <w:left w:w="120" w:type="dxa"/>
-              <w:bottom w:w="70" w:type="dxa"/>
-              <w:right w:w="120" w:type="dxa"/>
-            </w:tcMar>
-          </w:tcPr>
-          <w:p>
-            <w:pPr>
-              <w:jc w:val="center"/>
-            </w:pPr>
-            <w:r>
-              <w:rPr>
-                <w:b/>
-                <w:bCs/>
-                <w:color w:val="1A3A6B"/>
-                <w:sz w:val="19"/>
-                <w:szCs w:val="19"/>
-              </w:rPr>
-              <w:t>5</w:t>
-            </w:r>
-          </w:p>
-        </w:tc>
-        <w:tc>
-          <w:tcPr>
-            <w:tcW w:w="2500" w:type="dxa"/>
-            <w:tcBorders>
-              <w:top w:val="single" w:sz="4" w:space="0" w:color="C8D4E8"/>
-              <w:left w:val="single" w:sz="4" w:space="0" w:color="C8D4E8"/>
-              <w:bottom w:val="single" w:sz="4" w:space="0" w:color="C8D4E8"/>
-              <w:right w:val="single" w:sz="4" w:space="0" w:color="C8D4E8"/>
-            </w:tcBorders>
-            <w:shd w:val="clear" w:color="auto" w:fill="F5F8FF"/>
-            <w:tcMar>
-              <w:top w:w="70" w:type="dxa"/>
-              <w:left w:w="120" w:type="dxa"/>
-              <w:bottom w:w="70" w:type="dxa"/>
-              <w:right w:w="120" w:type="dxa"/>
-            </w:tcMar>
-          </w:tcPr>
-          <w:p>
-            <w:r>
-              <w:rPr>
-                <w:sz w:val="19"/>
-                <w:szCs w:val="19"/>
-              </w:rPr>
-              <w:t>Centre d’envoi (E024)</w:t>
-            </w:r>
-          </w:p>
-        </w:tc>
-        <w:tc>
-          <w:tcPr>
-            <w:tcW w:w="5726" w:type="dxa"/>
-            <w:tcBorders>
-              <w:top w:val="single" w:sz="4" w:space="0" w:color="C8D4E8"/>
-              <w:left w:val="single" w:sz="4" w:space="0" w:color="C8D4E8"/>
-              <w:bottom w:val="single" w:sz="4" w:space="0" w:color="C8D4E8"/>
-              <w:right w:val="single" w:sz="4" w:space="0" w:color="C8D4E8"/>
-            </w:tcBorders>
-            <w:shd w:val="clear" w:color="auto" w:fill="F5F8FF"/>
-            <w:tcMar>
-              <w:top w:w="70" w:type="dxa"/>
-              <w:left w:w="120" w:type="dxa"/>
-              <w:bottom w:w="70" w:type="dxa"/>
-              <w:right w:w="120" w:type="dxa"/>
-            </w:tcMar>
-          </w:tcPr>
-          <w:p>
-            <w:r>
-              <w:rPr>
-                <w:sz w:val="19"/>
-                <w:szCs w:val="19"/>
-              </w:rPr>
-              <w:t>Envoyer les convocations aux JA nommés (onglet « Convocation »).</w:t>
-            </w:r>
-          </w:p>
-        </w:tc>
-      </w:tr>
-      <w:tr>
-        <w:tblPrEx>
-          <w:tblCellMar>
-            <w:top w:w="0" w:type="dxa"/>
-            <w:bottom w:w="0" w:type="dxa"/>
-          </w:tblCellMar>
-        </w:tblPrEx>
-        <w:tc>
-          <w:tcPr>
-            <w:tcW w:w="800" w:type="dxa"/>
-            <w:tcBorders>
-              <w:top w:val="single" w:sz="4" w:space="0" w:color="C8D4E8"/>
-              <w:left w:val="single" w:sz="4" w:space="0" w:color="C8D4E8"/>
-              <w:bottom w:val="single" w:sz="4" w:space="0" w:color="C8D4E8"/>
-              <w:right w:val="single" w:sz="4" w:space="0" w:color="C8D4E8"/>
-            </w:tcBorders>
-            <w:shd w:val="clear" w:color="auto" w:fill="FFFFFF"/>
-            <w:tcMar>
-              <w:top w:w="70" w:type="dxa"/>
-              <w:left w:w="120" w:type="dxa"/>
-              <w:bottom w:w="70" w:type="dxa"/>
-              <w:right w:w="120" w:type="dxa"/>
-            </w:tcMar>
-          </w:tcPr>
-          <w:p>
-            <w:pPr>
-              <w:jc w:val="center"/>
-            </w:pPr>
-            <w:r>
-              <w:rPr>
-                <w:b/>
-                <w:bCs/>
-                <w:color w:val="1A3A6B"/>
-                <w:sz w:val="19"/>
-                <w:szCs w:val="19"/>
-              </w:rPr>
-              <w:t>6</w:t>
-            </w:r>
-          </w:p>
-        </w:tc>
-        <w:tc>
-          <w:tcPr>
-            <w:tcW w:w="2500" w:type="dxa"/>
-            <w:tcBorders>
-              <w:top w:val="single" w:sz="4" w:space="0" w:color="C8D4E8"/>
-              <w:left w:val="single" w:sz="4" w:space="0" w:color="C8D4E8"/>
-              <w:bottom w:val="single" w:sz="4" w:space="0" w:color="C8D4E8"/>
-              <w:right w:val="single" w:sz="4" w:space="0" w:color="C8D4E8"/>
-            </w:tcBorders>
-            <w:shd w:val="clear" w:color="auto" w:fill="FFFFFF"/>
-            <w:tcMar>
-              <w:top w:w="70" w:type="dxa"/>
-              <w:left w:w="120" w:type="dxa"/>
-              <w:bottom w:w="70" w:type="dxa"/>
-              <w:right w:w="120" w:type="dxa"/>
-            </w:tcMar>
-          </w:tcPr>
-          <w:p>
-            <w:r>
-              <w:rPr>
-                <w:sz w:val="19"/>
-                <w:szCs w:val="19"/>
-              </w:rPr>
-              <w:t>Centre d’envoi (E024)</w:t>
-            </w:r>
-          </w:p>
-        </w:tc>
-        <w:tc>
-          <w:tcPr>
-            <w:tcW w:w="5726" w:type="dxa"/>
-            <w:tcBorders>
-              <w:top w:val="single" w:sz="4" w:space="0" w:color="C8D4E8"/>
-              <w:left w:val="single" w:sz="4" w:space="0" w:color="C8D4E8"/>
-              <w:bottom w:val="single" w:sz="4" w:space="0" w:color="C8D4E8"/>
-              <w:right w:val="single" w:sz="4" w:space="0" w:color="C8D4E8"/>
-            </w:tcBorders>
-            <w:shd w:val="clear" w:color="auto" w:fill="FFFFFF"/>
-            <w:tcMar>
-              <w:top w:w="70" w:type="dxa"/>
-              <w:left w:w="120" w:type="dxa"/>
-              <w:bottom w:w="70" w:type="dxa"/>
-              <w:right w:w="120" w:type="dxa"/>
-            </w:tcMar>
-          </w:tcPr>
-          <w:p>
-            <w:r>
-              <w:rPr>
-                <w:sz w:val="19"/>
-                <w:szCs w:val="19"/>
-              </w:rPr>
-              <w:t>En fin de phase, envoyer la « Liste nomination » à chaque JA.</w:t>
+              <w:lastRenderedPageBreak/>
+              <w:drawing>
+                <wp:inline distT="0" distB="0" distL="0" distR="0" wp14:anchorId="29878869" wp14:editId="4F88EBC6">
+                  <wp:extent cx="6120130" cy="2881630"/>
+                  <wp:effectExtent l="0" t="0" r="0" b="0"/>
+                  <wp:docPr id="15" name="Image 15"/>
+                  <wp:cNvGraphicFramePr>
+                    <a:graphicFrameLocks xmlns:a="http://schemas.openxmlformats.org/drawingml/2006/main" noChangeAspect="1"/>
+                  </wp:cNvGraphicFramePr>
+                  <a:graphic xmlns:a="http://schemas.openxmlformats.org/drawingml/2006/main">
+                    <a:graphicData uri="http://schemas.openxmlformats.org/drawingml/2006/picture">
+                      <pic:pic xmlns:pic="http://schemas.openxmlformats.org/drawingml/2006/picture">
+                        <pic:nvPicPr>
+                          <pic:cNvPr id="1" name=""/>
+                          <pic:cNvPicPr/>
+                        </pic:nvPicPr>
+                        <pic:blipFill>
+                          <a:blip r:embed="rId21"/>
+                          <a:stretch>
+                            <a:fillRect/>
+                          </a:stretch>
+                        </pic:blipFill>
+                        <pic:spPr>
+                          <a:xfrm>
+                            <a:off x="0" y="0"/>
+                            <a:ext cx="6120130" cy="2881630"/>
+                          </a:xfrm>
+                          <a:prstGeom prst="rect">
+                            <a:avLst/>
+                          </a:prstGeom>
+                        </pic:spPr>
+                      </pic:pic>
+                    </a:graphicData>
+                  </a:graphic>
+                </wp:inline>
+              </w:drawing>
             </w:r>
           </w:p>
         </w:tc>
@@ -4654,8 +4035,8 @@
     </w:tbl>
     <w:p/>
     <w:sectPr>
-      <w:headerReference w:type="default" r:id="rId16"/>
-      <w:footerReference w:type="default" r:id="rId17"/>
+      <w:headerReference w:type="default" r:id="rId22"/>
+      <w:footerReference w:type="default" r:id="rId23"/>
       <w:pgSz w:w="11906" w:h="16838"/>
       <w:pgMar w:top="1134" w:right="1134" w:bottom="1134" w:left="1134" w:header="708" w:footer="708" w:gutter="0"/>
       <w:cols w:space="720"/>
@@ -5608,6 +4989,18 @@
       <w:szCs w:val="20"/>
     </w:rPr>
   </w:style>
+  <w:style w:type="character" w:styleId="Mentionnonrsolue">
+    <w:name w:val="Unresolved Mention"/>
+    <w:basedOn w:val="Policepardfaut"/>
+    <w:uiPriority w:val="99"/>
+    <w:semiHidden/>
+    <w:unhideWhenUsed/>
+    <w:rsid w:val="00E43C73"/>
+    <w:rPr>
+      <w:color w:val="605E5C"/>
+      <w:shd w:val="clear" w:color="auto" w:fill="E1DFDD"/>
+    </w:rPr>
+  </w:style>
 </w:styles>
 </file>
 

</xml_diff>